<commit_message>
Refactor: Improve name anonymization and add declension rules
Co-authored-by: vacl.dan <vacl.dan@gmail.com>
</commit_message>
<xml_diff>
--- a/smlouva4_anon.docx
+++ b/smlouva4_anon.docx
@@ -140,7 +140,7 @@
           <w:b/>
           <w:bCs/>
         </w:rPr>
-        <w:t>Michal Říha, nar. [[DATE_5]], trvale bytem [[ADDRESS_5]]</w:t>
+        <w:t>[[PERSON_7]], nar. [[DATE_5]], trvale bytem [[ADDRESS_5]]</w:t>
       </w:r>
       <w:r/>
     </w:p>
@@ -591,11 +591,10 @@
     <w:p>
       <w:r>
         <w:t>…………………………………</w:t>
-      </w:r>
-      <w:r>
         <w:br/>
-        <w:t>Michal Říha</w:t>
-      </w:r>
+        <w:t>[[PERSON_7]]</w:t>
+      </w:r>
+      <w:r/>
     </w:p>
     <w:p>
       <w:r>

</xml_diff>

<commit_message>
Add JSON mappings for contract data and names
Co-authored-by: vacl.dan <vacl.dan@gmail.com>
</commit_message>
<xml_diff>
--- a/smlouva4_anon.docx
+++ b/smlouva4_anon.docx
@@ -140,7 +140,7 @@
           <w:b/>
           <w:bCs/>
         </w:rPr>
-        <w:t>Michal Říha, nar. [[DATE_5]], trvale bytem [[ADDRESS_5]]</w:t>
+        <w:t>[[PERSON_7]], nar. [[DATE_5]], trvale bytem [[ADDRESS_5]]</w:t>
       </w:r>
       <w:r/>
     </w:p>
@@ -591,11 +591,10 @@
     <w:p>
       <w:r>
         <w:t>…………………………………</w:t>
-      </w:r>
-      <w:r>
         <w:br/>
-        <w:t>Michal Říha</w:t>
-      </w:r>
+        <w:t>[[PERSON_7]]</w:t>
+      </w:r>
+      <w:r/>
     </w:p>
     <w:p>
       <w:r>

</xml_diff>

<commit_message>
Fix: Correct person identifiers in map files
Co-authored-by: vacl.dan <vacl.dan@gmail.com>
</commit_message>
<xml_diff>
--- a/smlouva4_anon.docx
+++ b/smlouva4_anon.docx
@@ -72,7 +72,7 @@
           <w:b/>
           <w:bCs/>
         </w:rPr>
-        <w:t>[[PERSON_5]], nar. [[DATE_2]], trvale bytem [[ADDRESS_2]]</w:t>
+        <w:t>[[PERSON_4]], nar. [[DATE_2]], trvale bytem [[ADDRESS_2]]</w:t>
       </w:r>
       <w:r/>
     </w:p>
@@ -140,7 +140,7 @@
           <w:b/>
           <w:bCs/>
         </w:rPr>
-        <w:t>[[PERSON_7]], nar. [[DATE_5]], trvale bytem [[ADDRESS_5]]</w:t>
+        <w:t>[[PERSON_6]], nar. [[DATE_5]], trvale bytem [[ADDRESS_5]]</w:t>
       </w:r>
       <w:r/>
     </w:p>
@@ -156,7 +156,7 @@
           <w:b/>
           <w:bCs/>
         </w:rPr>
-        <w:t>[[PERSON_6]], nar. [[DATE_6]], trvale bytem [[ADDRESS_6]]</w:t>
+        <w:t>[[PERSON_5]], nar. [[DATE_6]], trvale bytem [[ADDRESS_6]]</w:t>
       </w:r>
       <w:r/>
     </w:p>
@@ -219,7 +219,7 @@
         </w:numPr>
       </w:pPr>
       <w:r>
-        <w:t>Dlužníci tímto potvrzují, že jim byla uvedená částka předána dne [[DATE_7]] v hotovosti v přítomnosti svědka, paní [[PERSON_5]].</w:t>
+        <w:t>Dlužníci tímto potvrzují, že jim byla uvedená částka předána dne [[DATE_7]] v hotovosti v přítomnosti svědka, paní [[PERSON_4]].</w:t>
       </w:r>
       <w:r>
         <w:rPr>
@@ -339,7 +339,7 @@
         </w:numPr>
       </w:pPr>
       <w:r>
-        <w:t>V případě prodlení delšího než 14 dní je věřitelka [[PERSON_5]] oprávněna uplatnit smluvní pokutu ve výši 1 000 Kč za každý započatý měsíc prodlení.</w:t>
+        <w:t>V případě prodlení delšího než 14 dní je věřitelka [[PERSON_4]] oprávněna uplatnit smluvní pokutu ve výši 1 000 Kč za každý započatý měsíc prodlení.</w:t>
       </w:r>
       <w:r>
         <w:rPr>
@@ -357,7 +357,7 @@
         </w:numPr>
       </w:pPr>
       <w:r>
-        <w:t>Všichni dlužníci jsou odpovědní společně a nerozdílně, tzn. že věřitelé mohou požadovat plnění celé částky po kterémkoli z nich, například i po [[PERSON_6]] nebo [[PERSON_7]].</w:t>
+        <w:t>Všichni dlužníci jsou odpovědní společně a nerozdílně, tzn. že věřitelé mohou požadovat plnění celé částky po kterémkoli z nich, například i po [[PERSON_5]] nebo [[PERSON_6]].</w:t>
       </w:r>
       <w:r>
         <w:rPr>
@@ -561,7 +561,7 @@
       <w:r>
         <w:t>…………………………………</w:t>
         <w:br/>
-        <w:t>[[PERSON_5]]</w:t>
+        <w:t>[[PERSON_4]]</w:t>
       </w:r>
       <w:r/>
     </w:p>
@@ -592,7 +592,7 @@
       <w:r>
         <w:t>…………………………………</w:t>
         <w:br/>
-        <w:t>[[PERSON_7]]</w:t>
+        <w:t>[[PERSON_6]]</w:t>
       </w:r>
       <w:r/>
     </w:p>
@@ -600,7 +600,7 @@
       <w:r>
         <w:t>…………………………………</w:t>
         <w:br/>
-        <w:t>[[PERSON_6]]</w:t>
+        <w:t>[[PERSON_5]]</w:t>
       </w:r>
       <w:r/>
     </w:p>

</xml_diff>

<commit_message>
Přidání testovacích souborů a aktualizovaných výstupů
- test_inference.py: Testy pro inference funkcí pádů
- test_inference_debug.py: Debug testy pro specifické případy
- smlouva4_anon.docx: Aktualizovaný anonymizovaný dokument
- smlouva4_map.txt: Aktualizovaná mapa anonymizace (7 osob místo 10)
- smlouva4_map.json: JSON verze mapy anonymizace

Výstupy ukazují vylepšené sloučení osob v různých pádech.

🤖 Generated with [Claude Code](https://claude.com/claude-code)

Co-Authored-By: Claude <noreply@anthropic.com>
</commit_message>
<xml_diff>
--- a/smlouva4_anon.docx
+++ b/smlouva4_anon.docx
@@ -140,7 +140,7 @@
           <w:b/>
           <w:bCs/>
         </w:rPr>
-        <w:t>Michal Říha, nar. [[DATE_5]], trvale bytem [[ADDRESS_5]]</w:t>
+        <w:t>[[PERSON_7]], nar. [[DATE_5]], trvale bytem [[ADDRESS_5]]</w:t>
       </w:r>
       <w:r/>
     </w:p>
@@ -591,11 +591,10 @@
     <w:p>
       <w:r>
         <w:t>…………………………………</w:t>
-      </w:r>
-      <w:r>
         <w:br/>
-        <w:t>Michal Říha</w:t>
-      </w:r>
+        <w:t>[[PERSON_7]]</w:t>
+      </w:r>
+      <w:r/>
     </w:p>
     <w:p>
       <w:r>

</xml_diff>